<commit_message>
Plan de mejoras propuestas
</commit_message>
<xml_diff>
--- a/informe_mejoras_implementadas.docx
+++ b/informe_mejoras_implementadas.docx
@@ -2628,6 +2628,1953 @@
           <w:szCs w:val="20"/>
         </w:rPr>
         <w:t xml:space="preserve">Herding selection es más lento que random (O(N·K) vs O(N)), pero se ejecuta solo una vez por tarea. Para buffers de 10K muestras es &lt; 5 segundos.</w:t>
+      </w:r>
+    </w:p>
+    <w:p/>
+    <w:p/>
+    <w:p>
+      <w:pPr>
+        <w:pStyle w:val="Heading1"/>
+      </w:pPr>
+      <w:r>
+        <w:t>6. Propuestas de Mejora Adicionales — Revisión Crítica del Código v2</w:t>
+      </w:r>
+    </w:p>
+    <w:p>
+      <w:r>
+        <w:rPr>
+          <w:b w:val="0"/>
+          <w:i w:val="0"/>
+        </w:rPr>
+        <w:t>Esta sección documenta hallazgos detectados tras una auditoría completa del código actualmente disponible en C:\git (model.py, data_utils.py, incremental_engine.py, evaluation.py y main_pipeline.py). Las propuestas se agrupan por nivel de criticidad: primero los bloqueos que impiden la ejecución del pipeline tal como está (Tier 0), seguidos de los puntos que afectan a la validez metodológica (Tier 1), las mejoras de calidad del modelo (Tier 2) y las cuestiones de robustez e ingeniería (Tier 3). Cada propuesta indica qué problema resuelve, cuál es el cambio concreto y el impacto esperado.</w:t>
+      </w:r>
+    </w:p>
+    <w:p>
+      <w:pPr>
+        <w:pStyle w:val="Heading2"/>
+      </w:pPr>
+      <w:r>
+        <w:t>6.1 Tier 0 — Bugs bloqueantes (el pipeline no termina hoy)</w:t>
+      </w:r>
+    </w:p>
+    <w:p>
+      <w:r>
+        <w:rPr>
+          <w:b w:val="0"/>
+          <w:i w:val="0"/>
+        </w:rPr>
+        <w:t>El pipeline actual presenta cuatro defectos que impiden que las fases 5 y 6 lleguen a ejecutarse correctamente. El primero es un AttributeError directo; los demás son silenciosos pero corrompen los resultados o consumen recursos innecesariamente.</w:t>
+      </w:r>
+    </w:p>
+    <w:p>
+      <w:pPr>
+        <w:pStyle w:val="Heading3"/>
+      </w:pPr>
+      <w:r>
+        <w:t>6.1.1  Métodos multi-head ausentes en ResNetSNR</w:t>
+      </w:r>
+    </w:p>
+    <w:p>
+      <w:r>
+        <w:rPr>
+          <w:b/>
+        </w:rPr>
+        <w:t>Problema:</w:t>
+      </w:r>
+      <w:r>
+        <w:t xml:space="preserve">  main_pipeline.py llama a model_adapted.add_head("wisig"), set_active_head("wisig"), accede a model_adapted.heads y model_adapted.active_head (líneas 766, 767, 820, 835, 1003, 1004 y 1009). Ninguno de esos atributos/métodos está definido en la clase ResNetSNR de model.py — esta clase solo expone self.regressor. La consecuencia es un AttributeError en la línea 766 al iniciar la Fase 5, que aborta todo el bloque cross-domain (Fases 5 y 6, almacenamiento del checkpoint adaptado y validity report).</w:t>
+      </w:r>
+    </w:p>
+    <w:p>
+      <w:r>
+        <w:rPr>
+          <w:b/>
+        </w:rPr>
+        <w:t>Impacto:</w:t>
+      </w:r>
+      <w:r>
+        <w:t xml:space="preserve">  BLOQUEANTE. Sin multi-head no hay separación estructural entre el head_radio (intacto) y el head_wisig (entrenable). La afirmación del CONFIG ("esto elimina estructuralmente el olvido cross-domain") no se cumple porque no existe el mecanismo que la sostiene.</w:t>
+      </w:r>
+    </w:p>
+    <w:p>
+      <w:r>
+        <w:rPr>
+          <w:b/>
+        </w:rPr>
+        <w:t>Cambio propuesto:</w:t>
+      </w:r>
+      <w:r>
+        <w:t xml:space="preserve">  Añadir en ResNetSNR un nn.ModuleDict de heads y los métodos add_head/set_active_head. El head por defecto se renombra internamente como "radio" pero se preserva self.regressor como alias para no romper checkpoints previos.</w:t>
+      </w:r>
+    </w:p>
+    <w:tbl>
+      <w:tblPr>
+        <w:tblW w:type="auto" w:w="0"/>
+        <w:tblLook w:firstColumn="1" w:firstRow="1" w:lastColumn="0" w:lastRow="0" w:noHBand="0" w:noVBand="1" w:val="04A0"/>
+      </w:tblPr>
+      <w:tblGrid>
+        <w:gridCol w:w="9360"/>
+      </w:tblGrid>
+      <w:tr>
+        <w:tc>
+          <w:tcPr>
+            <w:tcW w:type="dxa" w:w="9360"/>
+          </w:tcPr>
+          <w:p>
+            <w:r/>
+            <w:r>
+              <w:rPr>
+                <w:rFonts w:ascii="Consolas" w:hAnsi="Consolas"/>
+                <w:sz w:val="18"/>
+              </w:rPr>
+              <w:t># model.py — dentro de ResNetSNR.__init__ (después de definir self.regressor)</w:t>
+            </w:r>
+          </w:p>
+          <w:p>
+            <w:r>
+              <w:rPr>
+                <w:rFonts w:ascii="Consolas" w:hAnsi="Consolas"/>
+                <w:sz w:val="18"/>
+              </w:rPr>
+              <w:t>self.heads = nn.ModuleDict({"radio": self.regressor})</w:t>
+            </w:r>
+          </w:p>
+          <w:p>
+            <w:r>
+              <w:rPr>
+                <w:rFonts w:ascii="Consolas" w:hAnsi="Consolas"/>
+                <w:sz w:val="18"/>
+              </w:rPr>
+              <w:t>self.active_head = "radio"</w:t>
+            </w:r>
+          </w:p>
+          <w:p>
+            <w:r>
+              <w:rPr>
+                <w:rFonts w:ascii="Consolas" w:hAnsi="Consolas"/>
+                <w:sz w:val="18"/>
+              </w:rPr>
+            </w:r>
+          </w:p>
+          <w:p>
+            <w:r>
+              <w:rPr>
+                <w:rFonts w:ascii="Consolas" w:hAnsi="Consolas"/>
+                <w:sz w:val="18"/>
+              </w:rPr>
+              <w:t>def add_head(self, name, hidden=128, dropout=0.3):</w:t>
+            </w:r>
+          </w:p>
+          <w:p>
+            <w:r>
+              <w:rPr>
+                <w:rFonts w:ascii="Consolas" w:hAnsi="Consolas"/>
+                <w:sz w:val="18"/>
+              </w:rPr>
+              <w:t xml:space="preserve">    if name in self.heads:</w:t>
+            </w:r>
+          </w:p>
+          <w:p>
+            <w:r>
+              <w:rPr>
+                <w:rFonts w:ascii="Consolas" w:hAnsi="Consolas"/>
+                <w:sz w:val="18"/>
+              </w:rPr>
+              <w:t xml:space="preserve">        raise ValueError(f"Head '{name}' ya existe")</w:t>
+            </w:r>
+          </w:p>
+          <w:p>
+            <w:r>
+              <w:rPr>
+                <w:rFonts w:ascii="Consolas" w:hAnsi="Consolas"/>
+                <w:sz w:val="18"/>
+              </w:rPr>
+              <w:t xml:space="preserve">    self.heads[name] = nn.Sequential(</w:t>
+            </w:r>
+          </w:p>
+          <w:p>
+            <w:r>
+              <w:rPr>
+                <w:rFonts w:ascii="Consolas" w:hAnsi="Consolas"/>
+                <w:sz w:val="18"/>
+              </w:rPr>
+              <w:t xml:space="preserve">        nn.Flatten(),</w:t>
+            </w:r>
+          </w:p>
+          <w:p>
+            <w:r>
+              <w:rPr>
+                <w:rFonts w:ascii="Consolas" w:hAnsi="Consolas"/>
+                <w:sz w:val="18"/>
+              </w:rPr>
+              <w:t xml:space="preserve">        nn.Linear(256, hidden),</w:t>
+            </w:r>
+          </w:p>
+          <w:p>
+            <w:r>
+              <w:rPr>
+                <w:rFonts w:ascii="Consolas" w:hAnsi="Consolas"/>
+                <w:sz w:val="18"/>
+              </w:rPr>
+              <w:t xml:space="preserve">        nn.ReLU(inplace=True),</w:t>
+            </w:r>
+          </w:p>
+          <w:p>
+            <w:r>
+              <w:rPr>
+                <w:rFonts w:ascii="Consolas" w:hAnsi="Consolas"/>
+                <w:sz w:val="18"/>
+              </w:rPr>
+              <w:t xml:space="preserve">        nn.Dropout(dropout),</w:t>
+            </w:r>
+          </w:p>
+          <w:p>
+            <w:r>
+              <w:rPr>
+                <w:rFonts w:ascii="Consolas" w:hAnsi="Consolas"/>
+                <w:sz w:val="18"/>
+              </w:rPr>
+              <w:t xml:space="preserve">        nn.Linear(hidden, 1),</w:t>
+            </w:r>
+          </w:p>
+          <w:p>
+            <w:r>
+              <w:rPr>
+                <w:rFonts w:ascii="Consolas" w:hAnsi="Consolas"/>
+                <w:sz w:val="18"/>
+              </w:rPr>
+              <w:t xml:space="preserve">    )</w:t>
+            </w:r>
+          </w:p>
+          <w:p>
+            <w:r>
+              <w:rPr>
+                <w:rFonts w:ascii="Consolas" w:hAnsi="Consolas"/>
+                <w:sz w:val="18"/>
+              </w:rPr>
+              <w:t xml:space="preserve">    nn.init.kaiming_normal_(self.heads[name][1].weight)</w:t>
+            </w:r>
+          </w:p>
+          <w:p>
+            <w:r>
+              <w:rPr>
+                <w:rFonts w:ascii="Consolas" w:hAnsi="Consolas"/>
+                <w:sz w:val="18"/>
+              </w:rPr>
+              <w:t xml:space="preserve">    nn.init.kaiming_normal_(self.heads[name][4].weight)</w:t>
+            </w:r>
+          </w:p>
+          <w:p>
+            <w:r>
+              <w:rPr>
+                <w:rFonts w:ascii="Consolas" w:hAnsi="Consolas"/>
+                <w:sz w:val="18"/>
+              </w:rPr>
+            </w:r>
+          </w:p>
+          <w:p>
+            <w:r>
+              <w:rPr>
+                <w:rFonts w:ascii="Consolas" w:hAnsi="Consolas"/>
+                <w:sz w:val="18"/>
+              </w:rPr>
+              <w:t>def set_active_head(self, name):</w:t>
+            </w:r>
+          </w:p>
+          <w:p>
+            <w:r>
+              <w:rPr>
+                <w:rFonts w:ascii="Consolas" w:hAnsi="Consolas"/>
+                <w:sz w:val="18"/>
+              </w:rPr>
+              <w:t xml:space="preserve">    # name=None ó "radio" → head original; cualquier otro → ModuleDict</w:t>
+            </w:r>
+          </w:p>
+          <w:p>
+            <w:r>
+              <w:rPr>
+                <w:rFonts w:ascii="Consolas" w:hAnsi="Consolas"/>
+                <w:sz w:val="18"/>
+              </w:rPr>
+              <w:t xml:space="preserve">    self.active_head = name if name is not None else "radio"</w:t>
+            </w:r>
+          </w:p>
+          <w:p>
+            <w:r>
+              <w:rPr>
+                <w:rFonts w:ascii="Consolas" w:hAnsi="Consolas"/>
+                <w:sz w:val="18"/>
+              </w:rPr>
+            </w:r>
+          </w:p>
+          <w:p>
+            <w:r>
+              <w:rPr>
+                <w:rFonts w:ascii="Consolas" w:hAnsi="Consolas"/>
+                <w:sz w:val="18"/>
+              </w:rPr>
+              <w:t>def forward(self, x):</w:t>
+            </w:r>
+          </w:p>
+          <w:p>
+            <w:r>
+              <w:rPr>
+                <w:rFonts w:ascii="Consolas" w:hAnsi="Consolas"/>
+                <w:sz w:val="18"/>
+              </w:rPr>
+              <w:t xml:space="preserve">    features = self.extract_features(x)</w:t>
+            </w:r>
+          </w:p>
+          <w:p>
+            <w:r>
+              <w:rPr>
+                <w:rFonts w:ascii="Consolas" w:hAnsi="Consolas"/>
+                <w:sz w:val="18"/>
+              </w:rPr>
+              <w:t xml:space="preserve">    head = self.heads[self.active_head]</w:t>
+            </w:r>
+          </w:p>
+          <w:p>
+            <w:r>
+              <w:rPr>
+                <w:rFonts w:ascii="Consolas" w:hAnsi="Consolas"/>
+                <w:sz w:val="18"/>
+              </w:rPr>
+              <w:t xml:space="preserve">    return head(features).squeeze(1)</w:t>
+            </w:r>
+          </w:p>
+        </w:tc>
+      </w:tr>
+    </w:tbl>
+    <w:p>
+      <w:pPr>
+        <w:pStyle w:val="Heading3"/>
+      </w:pPr>
+      <w:r>
+        <w:t>6.1.2  El filtro trainable_keys no congela correctamente sin multi-head</w:t>
+      </w:r>
+    </w:p>
+    <w:p>
+      <w:r>
+        <w:rPr>
+          <w:b/>
+        </w:rPr>
+        <w:t>Problema:</w:t>
+      </w:r>
+      <w:r>
+        <w:t xml:space="preserve">  Las líneas 775–782 hacen p.requires_grad = any(k in name for k in trainable_keys) con trainable_keys=["heads.wisig"]. Sin la corrección de 6.1.1 ningún parámetro contiene "heads.wisig" en su nombre, así que TODOS los parámetros quedan con requires_grad=False y el modelo no aprende nada en T5 (val_mae constante, best_epoch=1).</w:t>
+      </w:r>
+    </w:p>
+    <w:p>
+      <w:r>
+        <w:rPr>
+          <w:b/>
+        </w:rPr>
+        <w:t>Cambio propuesto:</w:t>
+      </w:r>
+      <w:r>
+        <w:t xml:space="preserve">  Tras aplicar 6.1.1, los nombres serán "heads.wisig.1.weight", "heads.wisig.4.bias", etc., y el filtro funcionará. Conviene imprimir explícitamente los parámetros entrenables como sanity check (ya lo hace la línea 785, pero conviene comprobar que el porcentaje no es 0 %).</w:t>
+      </w:r>
+    </w:p>
+    <w:p>
+      <w:pPr>
+        <w:pStyle w:val="Heading3"/>
+      </w:pPr>
+      <w:r>
+        <w:t>6.1.3  _init_weights no inicializa GroupNorm (norma por defecto)</w:t>
+      </w:r>
+    </w:p>
+    <w:p>
+      <w:r>
+        <w:rPr>
+          <w:b/>
+        </w:rPr>
+        <w:t>Problema:</w:t>
+      </w:r>
+      <w:r>
+        <w:t xml:space="preserve">  model.py línea 144–152 itera sobre los módulos y solo trata Conv1d, BatchNorm1d y Linear. Con la opción por defecto norm="group", el branch BatchNorm1d nunca se ejecuta, así que los pesos affine de GroupNorm quedan con la inicialización por defecto de PyTorch (weight=1, bias=0 — coincide, pero no es declarativo). Si en el futuro se cambia el num_groups o la implementación de GroupNorm, la ausencia es difícil de detectar.</w:t>
+      </w:r>
+    </w:p>
+    <w:p>
+      <w:r>
+        <w:rPr>
+          <w:b/>
+        </w:rPr>
+        <w:t>Cambio propuesto:</w:t>
+      </w:r>
+      <w:r>
+        <w:t xml:space="preserve">  Añadir un elif que cubra nn.GroupNorm.</w:t>
+      </w:r>
+    </w:p>
+    <w:tbl>
+      <w:tblPr>
+        <w:tblW w:type="auto" w:w="0"/>
+        <w:tblLook w:firstColumn="1" w:firstRow="1" w:lastColumn="0" w:lastRow="0" w:noHBand="0" w:noVBand="1" w:val="04A0"/>
+      </w:tblPr>
+      <w:tblGrid>
+        <w:gridCol w:w="9360"/>
+      </w:tblGrid>
+      <w:tr>
+        <w:tc>
+          <w:tcPr>
+            <w:tcW w:type="dxa" w:w="9360"/>
+          </w:tcPr>
+          <w:p>
+            <w:r/>
+            <w:r>
+              <w:rPr>
+                <w:rFonts w:ascii="Consolas" w:hAnsi="Consolas"/>
+                <w:sz w:val="18"/>
+              </w:rPr>
+              <w:t>elif isinstance(m, (nn.BatchNorm1d, nn.GroupNorm, nn.InstanceNorm1d)):</w:t>
+            </w:r>
+          </w:p>
+          <w:p>
+            <w:r>
+              <w:rPr>
+                <w:rFonts w:ascii="Consolas" w:hAnsi="Consolas"/>
+                <w:sz w:val="18"/>
+              </w:rPr>
+              <w:t xml:space="preserve">    if m.weight is not None:</w:t>
+            </w:r>
+          </w:p>
+          <w:p>
+            <w:r>
+              <w:rPr>
+                <w:rFonts w:ascii="Consolas" w:hAnsi="Consolas"/>
+                <w:sz w:val="18"/>
+              </w:rPr>
+              <w:t xml:space="preserve">        nn.init.constant_(m.weight, 1)</w:t>
+            </w:r>
+          </w:p>
+          <w:p>
+            <w:r>
+              <w:rPr>
+                <w:rFonts w:ascii="Consolas" w:hAnsi="Consolas"/>
+                <w:sz w:val="18"/>
+              </w:rPr>
+              <w:t xml:space="preserve">    if m.bias is not None:</w:t>
+            </w:r>
+          </w:p>
+          <w:p>
+            <w:r>
+              <w:rPr>
+                <w:rFonts w:ascii="Consolas" w:hAnsi="Consolas"/>
+                <w:sz w:val="18"/>
+              </w:rPr>
+              <w:t xml:space="preserve">        nn.init.constant_(m.bias, 0)</w:t>
+            </w:r>
+          </w:p>
+        </w:tc>
+      </w:tr>
+    </w:tbl>
+    <w:p>
+      <w:pPr>
+        <w:pStyle w:val="Heading3"/>
+      </w:pPr>
+      <w:r>
+        <w:t>6.1.4  AdamW recibe parámetros congelados</w:t>
+      </w:r>
+    </w:p>
+    <w:p>
+      <w:r>
+        <w:rPr>
+          <w:b/>
+        </w:rPr>
+        <w:t>Problema:</w:t>
+      </w:r>
+      <w:r>
+        <w:t xml:space="preserve">  En train_task_incremental (incremental_engine.py:367) el optimizer se instancia con model.parameters(), que incluye también los parámetros con requires_grad=False. PyTorch ignora sus gradientes pero AdamW registra buffers de momentos (exp_avg, exp_avg_sq) para cada uno. Esto sí ocurre en T5 (multi-head: ~316K params congelados de 350K).</w:t>
+      </w:r>
+    </w:p>
+    <w:p>
+      <w:r>
+        <w:rPr>
+          <w:b/>
+        </w:rPr>
+        <w:t>Cambio propuesto:</w:t>
+      </w:r>
+      <w:r>
+        <w:t xml:space="preserve">  Filtrar por requires_grad antes de pasarlos al optimizer.</w:t>
+      </w:r>
+    </w:p>
+    <w:tbl>
+      <w:tblPr>
+        <w:tblW w:type="auto" w:w="0"/>
+        <w:tblLook w:firstColumn="1" w:firstRow="1" w:lastColumn="0" w:lastRow="0" w:noHBand="0" w:noVBand="1" w:val="04A0"/>
+      </w:tblPr>
+      <w:tblGrid>
+        <w:gridCol w:w="9360"/>
+      </w:tblGrid>
+      <w:tr>
+        <w:tc>
+          <w:tcPr>
+            <w:tcW w:type="dxa" w:w="9360"/>
+          </w:tcPr>
+          <w:p>
+            <w:r/>
+            <w:r>
+              <w:rPr>
+                <w:rFonts w:ascii="Consolas" w:hAnsi="Consolas"/>
+                <w:sz w:val="18"/>
+              </w:rPr>
+              <w:t>trainable = [p for p in model.parameters() if p.requires_grad]</w:t>
+            </w:r>
+          </w:p>
+          <w:p>
+            <w:r>
+              <w:rPr>
+                <w:rFonts w:ascii="Consolas" w:hAnsi="Consolas"/>
+                <w:sz w:val="18"/>
+              </w:rPr>
+              <w:t>optimizer = torch.optim.AdamW(trainable, lr=lr, weight_decay=1e-4)</w:t>
+            </w:r>
+          </w:p>
+        </w:tc>
+      </w:tr>
+    </w:tbl>
+    <w:p>
+      <w:pPr>
+        <w:pStyle w:val="Heading2"/>
+      </w:pPr>
+      <w:r>
+        <w:t>6.2 Tier 1 — Validez metodológica (defensa ante tribunal)</w:t>
+      </w:r>
+    </w:p>
+    <w:p>
+      <w:r>
+        <w:rPr>
+          <w:b w:val="0"/>
+          <w:i w:val="0"/>
+        </w:rPr>
+        <w:t>Estos puntos no impiden la ejecución pero comprometen la interpretación de los resultados. Conviene resolverlos antes de generar las tablas que irán a la memoria escrita.</w:t>
+      </w:r>
+    </w:p>
+    <w:p>
+      <w:pPr>
+        <w:pStyle w:val="Heading3"/>
+      </w:pPr>
+      <w:r>
+        <w:t>6.2.1  Pseudo-labels en WiSig: SNR_AWGN_añadido ≠ SNR físico real</w:t>
+      </w:r>
+    </w:p>
+    <w:p>
+      <w:r>
+        <w:rPr>
+          <w:b/>
+        </w:rPr>
+        <w:t>Problema:</w:t>
+      </w:r>
+      <w:r>
+        <w:t xml:space="preserve">  generate_wisig_pseudo_labels normaliza cada señal WiSig a potencia unitaria y luego añade AWGN con potencia 1/SNR_target_linear. La etiqueta asignada es exactamente el SNR del AWGN añadido, NO el SNR total de la señal degradada (que incluye también el ruido pre-existente del canal real). En el documento actual el target se llama indistintamente "SNR", lo que puede inducir a una interpretación física incorrecta del MAE reportado en la Fase 5.</w:t>
+      </w:r>
+    </w:p>
+    <w:p>
+      <w:r>
+        <w:rPr>
+          <w:b/>
+        </w:rPr>
+        <w:t>Impacto:</w:t>
+      </w:r>
+      <w:r>
+        <w:t xml:space="preserve">  El MAE de T5 (≈1 dB en pseudo-labels) NO es comparable con un MAE frente a SNR físico real. La calibración cross-domain está midiendo "capacidad del modelo de revertir AWGN sintético", no "capacidad de estimar SNR físico de tramas WiFi reales". El propio main_pipeline ya lo reconoce en una línea ("AVISO: ambos miden pseudo-labels, no SNR real"), pero la nomenclatura general del proyecto no lo refleja.</w:t>
+      </w:r>
+    </w:p>
+    <w:p>
+      <w:r>
+        <w:rPr>
+          <w:b/>
+        </w:rPr>
+        <w:t>Cambio propuesto:</w:t>
+      </w:r>
+      <w:r>
+        <w:t xml:space="preserve">  (a) Renombrar y_pseudo → y_snr_awgn_db en data_utils.py y evaluation.py. (b) Separar dos KPIs en Fase 6: KPI_aux = MAE sobre pseudo-labels (in-distribution, no externo); KPI_ext = Spearman ρ + sensibilidad + acuerdo M2M4 (validez física). (c) Añadir un párrafo explícito en el README y en la memoria que documente esta limitación.</w:t>
+      </w:r>
+    </w:p>
+    <w:p>
+      <w:pPr>
+        <w:pStyle w:val="Heading3"/>
+      </w:pPr>
+      <w:r>
+        <w:t>6.2.2  Tratamiento del punto "clean" en degradation_test</w:t>
+      </w:r>
+    </w:p>
+    <w:p>
+      <w:r>
+        <w:rPr>
+          <w:b/>
+        </w:rPr>
+        <w:t>Problema:</w:t>
+      </w:r>
+      <w:r>
+        <w:t xml:space="preserve">  evaluation.py:101 hace snr_values = [100 if s is None else s for s in snr_levels] y calcula Spearman ρ sobre estos snr_values. Usar 100 dB como sustituto de "clean" es una elección arbitraria. Si el modelo satura (predice 25 dB para cualquier SNR &gt; 25), el punto clean queda indistinguible del punto de 25 dB en la salida, lo que reduce artificialmente el Spearman. Más sutil: el "clean" de WiSig en realidad incluye ruido residual del canal, por lo que tampoco es literalmente clean.</w:t>
+      </w:r>
+    </w:p>
+    <w:p>
+      <w:r>
+        <w:rPr>
+          <w:b/>
+        </w:rPr>
+        <w:t>Cambio propuesto:</w:t>
+      </w:r>
+      <w:r>
+        <w:t xml:space="preserve">  (a) Excluir el punto clean del cálculo de Spearman cuando hay saturación visible (todos los means coinciden en el extremo superior). (b) Reportar Spearman_full y Spearman_no_clean para transparencia. (c) Sustituir 100 dB por np.nan y filtrarlo en el cálculo estadístico.</w:t>
+      </w:r>
+    </w:p>
+    <w:tbl>
+      <w:tblPr>
+        <w:tblW w:type="auto" w:w="0"/>
+        <w:tblLook w:firstColumn="1" w:firstRow="1" w:lastColumn="0" w:lastRow="0" w:noHBand="0" w:noVBand="1" w:val="04A0"/>
+      </w:tblPr>
+      <w:tblGrid>
+        <w:gridCol w:w="9360"/>
+      </w:tblGrid>
+      <w:tr>
+        <w:tc>
+          <w:tcPr>
+            <w:tcW w:type="dxa" w:w="9360"/>
+          </w:tcPr>
+          <w:p>
+            <w:r/>
+            <w:r>
+              <w:rPr>
+                <w:rFonts w:ascii="Consolas" w:hAnsi="Consolas"/>
+                <w:sz w:val="18"/>
+              </w:rPr>
+              <w:t># evaluation.py — degradation_test</w:t>
+            </w:r>
+          </w:p>
+          <w:p>
+            <w:r>
+              <w:rPr>
+                <w:rFonts w:ascii="Consolas" w:hAnsi="Consolas"/>
+                <w:sz w:val="18"/>
+              </w:rPr>
+              <w:t>snr_values = np.array([np.nan if s is None else s for s in snr_levels])</w:t>
+            </w:r>
+          </w:p>
+          <w:p>
+            <w:r>
+              <w:rPr>
+                <w:rFonts w:ascii="Consolas" w:hAnsi="Consolas"/>
+                <w:sz w:val="18"/>
+              </w:rPr>
+              <w:t>mask = ~np.isnan(snr_values)</w:t>
+            </w:r>
+          </w:p>
+          <w:p>
+            <w:r>
+              <w:rPr>
+                <w:rFonts w:ascii="Consolas" w:hAnsi="Consolas"/>
+                <w:sz w:val="18"/>
+              </w:rPr>
+              <w:t>rho_full, p_full = stats.spearmanr(snr_values[mask], np.array(mean_preds)[mask])</w:t>
+            </w:r>
+          </w:p>
+          <w:p>
+            <w:r>
+              <w:rPr>
+                <w:rFonts w:ascii="Consolas" w:hAnsi="Consolas"/>
+                <w:sz w:val="18"/>
+              </w:rPr>
+              <w:t>results["spearman_rho"] = rho_full</w:t>
+            </w:r>
+          </w:p>
+          <w:p>
+            <w:r>
+              <w:rPr>
+                <w:rFonts w:ascii="Consolas" w:hAnsi="Consolas"/>
+                <w:sz w:val="18"/>
+              </w:rPr>
+              <w:t>results["spearman_p"]   = p_full</w:t>
+            </w:r>
+          </w:p>
+        </w:tc>
+      </w:tr>
+    </w:tbl>
+    <w:p>
+      <w:pPr>
+        <w:pStyle w:val="Heading3"/>
+      </w:pPr>
+      <w:r>
+        <w:t>6.2.3  Estimación de Fisher en EWC</w:t>
+      </w:r>
+    </w:p>
+    <w:p>
+      <w:r>
+        <w:rPr>
+          <w:b/>
+        </w:rPr>
+        <w:t>Problema:</w:t>
+      </w:r>
+      <w:r>
+        <w:t xml:space="preserve">  EWC.register_task hace loss.backward() sobre batches enteros (donde loss = mean batch SmoothL1) y acumula p.grad² · batch_size. Esto estima E[(∂L_mean/∂θ)²] · B en lugar de E[(∂L_i/∂θ)²]. La práctica habitual de EWC usa batches de 1 muestra para evitar este sesgo (Kirkpatrick 2017 lo señala explícitamente). Con batch_size=256 el estimador subestima la varianza inter-muestra por un factor ~B y subestima por tanto la importancia relativa de los pesos críticos.</w:t>
+      </w:r>
+    </w:p>
+    <w:p>
+      <w:r>
+        <w:rPr>
+          <w:b/>
+        </w:rPr>
+        <w:t>Impacto:</w:t>
+      </w:r>
+      <w:r>
+        <w:t xml:space="preserve">  El λ_ewc óptimo se distorsiona: con la Fisher actual la magnitud típica del término EWC es ~B veces menor que la prescrita, así que λ_ewc=10 efectivamente actúa como λ ≈ 10/256. Esto puede explicar por qué la ablación 6 (λ=1) y 7 (λ=10) no muestran diferencias marcadas.</w:t>
+      </w:r>
+    </w:p>
+    <w:p>
+      <w:r>
+        <w:rPr>
+          <w:b/>
+        </w:rPr>
+        <w:t>Cambio propuesto:</w:t>
+      </w:r>
+      <w:r>
+        <w:t xml:space="preserve">  Iterar el cálculo por muestras individuales (n_samples=200 es suficiente, coste ~30 s).</w:t>
+      </w:r>
+    </w:p>
+    <w:tbl>
+      <w:tblPr>
+        <w:tblW w:type="auto" w:w="0"/>
+        <w:tblLook w:firstColumn="1" w:firstRow="1" w:lastColumn="0" w:lastRow="0" w:noHBand="0" w:noVBand="1" w:val="04A0"/>
+      </w:tblPr>
+      <w:tblGrid>
+        <w:gridCol w:w="9360"/>
+      </w:tblGrid>
+      <w:tr>
+        <w:tc>
+          <w:tcPr>
+            <w:tcW w:type="dxa" w:w="9360"/>
+          </w:tcPr>
+          <w:p>
+            <w:r/>
+            <w:r>
+              <w:rPr>
+                <w:rFonts w:ascii="Consolas" w:hAnsi="Consolas"/>
+                <w:sz w:val="18"/>
+              </w:rPr>
+              <w:t># incremental_engine.py — EWC.register_task</w:t>
+            </w:r>
+          </w:p>
+          <w:p>
+            <w:r>
+              <w:rPr>
+                <w:rFonts w:ascii="Consolas" w:hAnsi="Consolas"/>
+                <w:sz w:val="18"/>
+              </w:rPr>
+              <w:t>model.eval()</w:t>
+            </w:r>
+          </w:p>
+          <w:p>
+            <w:r>
+              <w:rPr>
+                <w:rFonts w:ascii="Consolas" w:hAnsi="Consolas"/>
+                <w:sz w:val="18"/>
+              </w:rPr>
+              <w:t>fisher_diag = {n: torch.zeros_like(p) for n, p in model.named_parameters()</w:t>
+            </w:r>
+          </w:p>
+          <w:p>
+            <w:r>
+              <w:rPr>
+                <w:rFonts w:ascii="Consolas" w:hAnsi="Consolas"/>
+                <w:sz w:val="18"/>
+              </w:rPr>
+              <w:t xml:space="preserve">               if p.requires_grad}</w:t>
+            </w:r>
+          </w:p>
+          <w:p>
+            <w:r>
+              <w:rPr>
+                <w:rFonts w:ascii="Consolas" w:hAnsi="Consolas"/>
+                <w:sz w:val="18"/>
+              </w:rPr>
+              <w:t>criterion = nn.SmoothL1Loss(reduction="sum")  # NO promediar</w:t>
+            </w:r>
+          </w:p>
+          <w:p>
+            <w:r>
+              <w:rPr>
+                <w:rFonts w:ascii="Consolas" w:hAnsi="Consolas"/>
+                <w:sz w:val="18"/>
+              </w:rPr>
+              <w:t>count = 0</w:t>
+            </w:r>
+          </w:p>
+          <w:p>
+            <w:r>
+              <w:rPr>
+                <w:rFonts w:ascii="Consolas" w:hAnsi="Consolas"/>
+                <w:sz w:val="18"/>
+              </w:rPr>
+              <w:t>for X_batch, y_batch in data_loader:</w:t>
+            </w:r>
+          </w:p>
+          <w:p>
+            <w:r>
+              <w:rPr>
+                <w:rFonts w:ascii="Consolas" w:hAnsi="Consolas"/>
+                <w:sz w:val="18"/>
+              </w:rPr>
+              <w:t xml:space="preserve">    if count &gt;= n_samples: break</w:t>
+            </w:r>
+          </w:p>
+          <w:p>
+            <w:r>
+              <w:rPr>
+                <w:rFonts w:ascii="Consolas" w:hAnsi="Consolas"/>
+                <w:sz w:val="18"/>
+              </w:rPr>
+              <w:t xml:space="preserve">    for i in range(X_batch.size(0)):</w:t>
+            </w:r>
+          </w:p>
+          <w:p>
+            <w:r>
+              <w:rPr>
+                <w:rFonts w:ascii="Consolas" w:hAnsi="Consolas"/>
+                <w:sz w:val="18"/>
+              </w:rPr>
+              <w:t xml:space="preserve">        if count &gt;= n_samples: break</w:t>
+            </w:r>
+          </w:p>
+          <w:p>
+            <w:r>
+              <w:rPr>
+                <w:rFonts w:ascii="Consolas" w:hAnsi="Consolas"/>
+                <w:sz w:val="18"/>
+              </w:rPr>
+              <w:t xml:space="preserve">        model.zero_grad()</w:t>
+            </w:r>
+          </w:p>
+          <w:p>
+            <w:r>
+              <w:rPr>
+                <w:rFonts w:ascii="Consolas" w:hAnsi="Consolas"/>
+                <w:sz w:val="18"/>
+              </w:rPr>
+              <w:t xml:space="preserve">        x_i = X_batch[i:i+1].to(device); y_i = y_batch[i:i+1].to(device)</w:t>
+            </w:r>
+          </w:p>
+          <w:p>
+            <w:r>
+              <w:rPr>
+                <w:rFonts w:ascii="Consolas" w:hAnsi="Consolas"/>
+                <w:sz w:val="18"/>
+              </w:rPr>
+              <w:t xml:space="preserve">        loss = criterion(model(x_i), y_i)</w:t>
+            </w:r>
+          </w:p>
+          <w:p>
+            <w:r>
+              <w:rPr>
+                <w:rFonts w:ascii="Consolas" w:hAnsi="Consolas"/>
+                <w:sz w:val="18"/>
+              </w:rPr>
+              <w:t xml:space="preserve">        loss.backward()</w:t>
+            </w:r>
+          </w:p>
+          <w:p>
+            <w:r>
+              <w:rPr>
+                <w:rFonts w:ascii="Consolas" w:hAnsi="Consolas"/>
+                <w:sz w:val="18"/>
+              </w:rPr>
+              <w:t xml:space="preserve">        for n, p in model.named_parameters():</w:t>
+            </w:r>
+          </w:p>
+          <w:p>
+            <w:r>
+              <w:rPr>
+                <w:rFonts w:ascii="Consolas" w:hAnsi="Consolas"/>
+                <w:sz w:val="18"/>
+              </w:rPr>
+              <w:t xml:space="preserve">            if p.requires_grad and p.grad is not None:</w:t>
+            </w:r>
+          </w:p>
+          <w:p>
+            <w:r>
+              <w:rPr>
+                <w:rFonts w:ascii="Consolas" w:hAnsi="Consolas"/>
+                <w:sz w:val="18"/>
+              </w:rPr>
+              <w:t xml:space="preserve">                fisher_diag[n] += p.grad.data ** 2</w:t>
+            </w:r>
+          </w:p>
+          <w:p>
+            <w:r>
+              <w:rPr>
+                <w:rFonts w:ascii="Consolas" w:hAnsi="Consolas"/>
+                <w:sz w:val="18"/>
+              </w:rPr>
+              <w:t xml:space="preserve">        count += 1</w:t>
+            </w:r>
+          </w:p>
+          <w:p>
+            <w:r>
+              <w:rPr>
+                <w:rFonts w:ascii="Consolas" w:hAnsi="Consolas"/>
+                <w:sz w:val="18"/>
+              </w:rPr>
+              <w:t>for n in fisher_diag: fisher_diag[n] /= max(count, 1)</w:t>
+            </w:r>
+          </w:p>
+        </w:tc>
+      </w:tr>
+    </w:tbl>
+    <w:p>
+      <w:pPr>
+        <w:pStyle w:val="Heading3"/>
+      </w:pPr>
+      <w:r>
+        <w:t>6.2.4  Sensibilidad bajo presencia de ruido pre-existente del canal</w:t>
+      </w:r>
+    </w:p>
+    <w:p>
+      <w:r>
+        <w:rPr>
+          <w:b/>
+        </w:rPr>
+        <w:t>Problema:</w:t>
+      </w:r>
+      <w:r>
+        <w:t xml:space="preserve">  La métrica mean_sensitivity = ΔSNR_pred / ΔSNR_ruido asume linealidad y que el ruido AWGN añadido domina sobre el ruido intrínseco del canal. Para WiSig real, en niveles altos de SNR_AWGN (20+ dB), el ruido del canal domina y la sensibilidad calculada se satura — un modelo perfecto daría una sensibilidad &lt; 1, lo cual no se debe a un fallo del modelo.</w:t>
+      </w:r>
+    </w:p>
+    <w:p>
+      <w:r>
+        <w:rPr>
+          <w:b/>
+        </w:rPr>
+        <w:t>Cambio propuesto:</w:t>
+      </w:r>
+      <w:r>
+        <w:t xml:space="preserve">  (a) Reportar sensibilidad solo en el régimen donde SNR_AWGN_añadido ≤ SNR_canal_estimado_por_M2M4. (b) Añadir una columna "régimen de ruido dominante" al report de validez.</w:t>
+      </w:r>
+    </w:p>
+    <w:p>
+      <w:pPr>
+        <w:pStyle w:val="Heading2"/>
+      </w:pPr>
+      <w:r>
+        <w:t>6.3 Tier 2 — Calidad del modelo (mejora cuantificable de MAE)</w:t>
+      </w:r>
+    </w:p>
+    <w:p>
+      <w:pPr>
+        <w:pStyle w:val="Heading3"/>
+      </w:pPr>
+      <w:r>
+        <w:t>6.3.1  Features físicas auxiliares concatenadas al GAP</w:t>
+      </w:r>
+    </w:p>
+    <w:p>
+      <w:r>
+        <w:rPr>
+          <w:b/>
+        </w:rPr>
+        <w:t>Problema:</w:t>
+      </w:r>
+      <w:r>
+        <w:t xml:space="preserve">  InstanceNorm1d normaliza cada muestra IQ por su media/std, ELIMINANDO toda información de magnitud absoluta. Para PSK/QAM con constelaciones discretas, la dispersión radial/angular sí preserva información de SNR. Para OFDM/WiFi, donde la señal es casi gaussiana, el SNR queda mucho más enterrado y el extractor convolucional debe inferirlo de propiedades estadísticas de alto orden (kurtosis, cumulantes).</w:t>
+      </w:r>
+    </w:p>
+    <w:p>
+      <w:r>
+        <w:rPr>
+          <w:b/>
+        </w:rPr>
+        <w:t>Cambio propuesto:</w:t>
+      </w:r>
+      <w:r>
+        <w:t xml:space="preserve">  Calcular features físicas baratas (M2, M4, kurtosis, varianza de amplitud instantánea) ANTES de la InstanceNorm y concatenarlas al vector de 256-d antes del head. Esto rompe la ceguera de escala sin perder la robustez cross-domain (las features son invariantes a rotación de fase y a permutación temporal).</w:t>
+      </w:r>
+    </w:p>
+    <w:tbl>
+      <w:tblPr>
+        <w:tblW w:type="auto" w:w="0"/>
+        <w:tblLook w:firstColumn="1" w:firstRow="1" w:lastColumn="0" w:lastRow="0" w:noHBand="0" w:noVBand="1" w:val="04A0"/>
+      </w:tblPr>
+      <w:tblGrid>
+        <w:gridCol w:w="9360"/>
+      </w:tblGrid>
+      <w:tr>
+        <w:tc>
+          <w:tcPr>
+            <w:tcW w:type="dxa" w:w="9360"/>
+          </w:tcPr>
+          <w:p>
+            <w:r/>
+            <w:r>
+              <w:rPr>
+                <w:rFonts w:ascii="Consolas" w:hAnsi="Consolas"/>
+                <w:sz w:val="18"/>
+              </w:rPr>
+              <w:t># model.py — ResNetSNR.extract_features (versión extendida)</w:t>
+            </w:r>
+          </w:p>
+          <w:p>
+            <w:r>
+              <w:rPr>
+                <w:rFonts w:ascii="Consolas" w:hAnsi="Consolas"/>
+                <w:sz w:val="18"/>
+              </w:rPr>
+              <w:t>def _physical_features(self, x):</w:t>
+            </w:r>
+          </w:p>
+          <w:p>
+            <w:r>
+              <w:rPr>
+                <w:rFonts w:ascii="Consolas" w:hAnsi="Consolas"/>
+                <w:sz w:val="18"/>
+              </w:rPr>
+              <w:t xml:space="preserve">    # x: (B, 2, L) sin normalizar</w:t>
+            </w:r>
+          </w:p>
+          <w:p>
+            <w:r>
+              <w:rPr>
+                <w:rFonts w:ascii="Consolas" w:hAnsi="Consolas"/>
+                <w:sz w:val="18"/>
+              </w:rPr>
+              <w:t xml:space="preserve">    p = (x[:, 0] ** 2 + x[:, 1] ** 2)          # (B, L) potencia instant.</w:t>
+            </w:r>
+          </w:p>
+          <w:p>
+            <w:r>
+              <w:rPr>
+                <w:rFonts w:ascii="Consolas" w:hAnsi="Consolas"/>
+                <w:sz w:val="18"/>
+              </w:rPr>
+              <w:t xml:space="preserve">    M2 = p.mean(dim=1, keepdim=True)</w:t>
+            </w:r>
+          </w:p>
+          <w:p>
+            <w:r>
+              <w:rPr>
+                <w:rFonts w:ascii="Consolas" w:hAnsi="Consolas"/>
+                <w:sz w:val="18"/>
+              </w:rPr>
+              <w:t xml:space="preserve">    M4 = (p ** 2).mean(dim=1, keepdim=True)</w:t>
+            </w:r>
+          </w:p>
+          <w:p>
+            <w:r>
+              <w:rPr>
+                <w:rFonts w:ascii="Consolas" w:hAnsi="Consolas"/>
+                <w:sz w:val="18"/>
+              </w:rPr>
+              <w:t xml:space="preserve">    kurt = M4 / (M2 ** 2 + 1e-8)</w:t>
+            </w:r>
+          </w:p>
+          <w:p>
+            <w:r>
+              <w:rPr>
+                <w:rFonts w:ascii="Consolas" w:hAnsi="Consolas"/>
+                <w:sz w:val="18"/>
+              </w:rPr>
+              <w:t xml:space="preserve">    log_M2 = torch.log(M2 + 1e-8)</w:t>
+            </w:r>
+          </w:p>
+          <w:p>
+            <w:r>
+              <w:rPr>
+                <w:rFonts w:ascii="Consolas" w:hAnsi="Consolas"/>
+                <w:sz w:val="18"/>
+              </w:rPr>
+              <w:t xml:space="preserve">    return torch.cat([log_M2, kurt, M2, M4], dim=1)   # (B, 4)</w:t>
+            </w:r>
+          </w:p>
+          <w:p>
+            <w:r>
+              <w:rPr>
+                <w:rFonts w:ascii="Consolas" w:hAnsi="Consolas"/>
+                <w:sz w:val="18"/>
+              </w:rPr>
+            </w:r>
+          </w:p>
+          <w:p>
+            <w:r>
+              <w:rPr>
+                <w:rFonts w:ascii="Consolas" w:hAnsi="Consolas"/>
+                <w:sz w:val="18"/>
+              </w:rPr>
+              <w:t>def forward(self, x):</w:t>
+            </w:r>
+          </w:p>
+          <w:p>
+            <w:r>
+              <w:rPr>
+                <w:rFonts w:ascii="Consolas" w:hAnsi="Consolas"/>
+                <w:sz w:val="18"/>
+              </w:rPr>
+              <w:t xml:space="preserve">    phys = self._physical_features(x)</w:t>
+            </w:r>
+          </w:p>
+          <w:p>
+            <w:r>
+              <w:rPr>
+                <w:rFonts w:ascii="Consolas" w:hAnsi="Consolas"/>
+                <w:sz w:val="18"/>
+              </w:rPr>
+              <w:t xml:space="preserve">    feat = self.extract_features(x)              # IN-norm aplicada dentro</w:t>
+            </w:r>
+          </w:p>
+          <w:p>
+            <w:r>
+              <w:rPr>
+                <w:rFonts w:ascii="Consolas" w:hAnsi="Consolas"/>
+                <w:sz w:val="18"/>
+              </w:rPr>
+              <w:t xml:space="preserve">    fused = torch.cat([feat, phys], dim=1)       # (B, 260)</w:t>
+            </w:r>
+          </w:p>
+          <w:p>
+            <w:r>
+              <w:rPr>
+                <w:rFonts w:ascii="Consolas" w:hAnsi="Consolas"/>
+                <w:sz w:val="18"/>
+              </w:rPr>
+              <w:t xml:space="preserve">    return self.heads[self.active_head](fused).squeeze(1)</w:t>
+            </w:r>
+          </w:p>
+          <w:p>
+            <w:r>
+              <w:rPr>
+                <w:rFonts w:ascii="Consolas" w:hAnsi="Consolas"/>
+                <w:sz w:val="18"/>
+              </w:rPr>
+              <w:t># Recordar: ajustar la primera Linear de cada head de 256 a 260 entradas.</w:t>
+            </w:r>
+          </w:p>
+        </w:tc>
+      </w:tr>
+    </w:tbl>
+    <w:p>
+      <w:pPr>
+        <w:pStyle w:val="Heading3"/>
+      </w:pPr>
+      <w:r>
+        <w:t>6.3.2  L2-normalizar features en Herding (como iCaRL original)</w:t>
+      </w:r>
+    </w:p>
+    <w:p>
+      <w:r>
+        <w:rPr>
+          <w:b/>
+        </w:rPr>
+        <w:t>Problema:</w:t>
+      </w:r>
+      <w:r>
+        <w:t xml:space="preserve">  _herding_select_from compara distancias L2 sin normalizar las features. Si una dimensión tiene mayor varianza, domina la selección. iCaRL (Rebuffi 2017) L2-normaliza explícitamente.</w:t>
+      </w:r>
+    </w:p>
+    <w:p>
+      <w:r>
+        <w:rPr>
+          <w:b/>
+        </w:rPr>
+        <w:t>Cambio propuesto:</w:t>
+      </w:r>
+      <w:r>
+        <w:t xml:space="preserve">  features = features / (np.linalg.norm(features, axis=1, keepdims=True) + 1e-8) antes de calcular centroide y selección.</w:t>
+      </w:r>
+    </w:p>
+    <w:p>
+      <w:pPr>
+        <w:pStyle w:val="Heading3"/>
+      </w:pPr>
+      <w:r>
+        <w:t>6.3.3  Batch balanceado: ratio fijo replay vs current</w:t>
+      </w:r>
+    </w:p>
+    <w:p>
+      <w:r>
+        <w:rPr>
+          <w:b/>
+        </w:rPr>
+        <w:t>Problema:</w:t>
+      </w:r>
+      <w:r>
+        <w:t xml:space="preserve">  Con buffer = 10K y task data ≈ 80K, los batches contienen ~28 muestras replay sobre 256 (11 %), así que KD aplica a una fracción minúscula y EWC compite con un gradiente de task loss enorme. Esto reduce drásticamente la eficacia anti-olvido teórica.</w:t>
+      </w:r>
+    </w:p>
+    <w:p>
+      <w:r>
+        <w:rPr>
+          <w:b/>
+        </w:rPr>
+        <w:t>Cambio propuesto:</w:t>
+      </w:r>
+      <w:r>
+        <w:t xml:space="preserve">  Usar dos DataLoaders concatenados con WeightedRandomSampler o BatchSampler personalizado para forzar un ratio fijo (e.g. 30 % replay / 70 % current). Implementación más simple: replicar las muestras de replay con factor (target_ratio·N_current/N_replay) antes de construir el dataset mixto.</w:t>
+      </w:r>
+    </w:p>
+    <w:p>
+      <w:pPr>
+        <w:pStyle w:val="Heading3"/>
+      </w:pPr>
+      <w:r>
+        <w:t>6.3.4  Componentes del loss reportadas por separado</w:t>
+      </w:r>
+    </w:p>
+    <w:p>
+      <w:r>
+        <w:rPr>
+          <w:b/>
+        </w:rPr>
+        <w:t>Problema:</w:t>
+      </w:r>
+      <w:r>
+        <w:t xml:space="preserve">  train_one_epoch_incremental suma loss_task + loss_kd + loss_ewc en una única loss escalar antes de reportarla. EWC es independiente del batch size, así que multiplicarla por batch_size en el running_loss infla artificialmente el train_loss reportado, dificultando la comparación entre estrategias.</w:t>
+      </w:r>
+    </w:p>
+    <w:p>
+      <w:r>
+        <w:rPr>
+          <w:b/>
+        </w:rPr>
+        <w:t>Cambio propuesto:</w:t>
+      </w:r>
+      <w:r>
+        <w:t xml:space="preserve">  Devolver dict {"task": ..., "kd": ..., "ewc": ...} y agregarlo por componente. Permite además detectar si EWC está dominando o siendo dominado.</w:t>
+      </w:r>
+    </w:p>
+    <w:p>
+      <w:pPr>
+        <w:pStyle w:val="Heading3"/>
+      </w:pPr>
+      <w:r>
+        <w:t>6.3.5  Augmentación temporal específica para señales IQ</w:t>
+      </w:r>
+    </w:p>
+    <w:p>
+      <w:r>
+        <w:rPr>
+          <w:b/>
+        </w:rPr>
+        <w:t>Cambio propuesto:</w:t>
+      </w:r>
+      <w:r>
+        <w:t xml:space="preserve">  Tres augmentations baratas y físicamente coherentes con el target (no modifican el SNR): (i) rotación de fase global θ ~ U[0, 2π] aplicada como [I·cosθ−Q·sinθ, I·sinθ+Q·cosθ]; (ii) random temporal crop dentro de la ventana (e.g. 96 muestras de 128); (iii) time-reverse cuando la modulación lo permita (no para señales que codifican memoria temporal). Aplicar solo en train, no en val/test.</w:t>
+      </w:r>
+    </w:p>
+    <w:p>
+      <w:pPr>
+        <w:pStyle w:val="Heading3"/>
+      </w:pPr>
+      <w:r>
+        <w:t>6.3.6  Early stopping con paciencia</w:t>
+      </w:r>
+    </w:p>
+    <w:p>
+      <w:r>
+        <w:rPr>
+          <w:b/>
+        </w:rPr>
+        <w:t>Cambio propuesto:</w:t>
+      </w:r>
+      <w:r>
+        <w:t xml:space="preserve">  patience=5 sobre val_mae. Reduce ~25 % del tiempo total porque las últimas épocas, con cosine LR cercano a 0, raramente mejoran el best.</w:t>
+      </w:r>
+    </w:p>
+    <w:tbl>
+      <w:tblPr>
+        <w:tblW w:type="auto" w:w="0"/>
+        <w:tblLook w:firstColumn="1" w:firstRow="1" w:lastColumn="0" w:lastRow="0" w:noHBand="0" w:noVBand="1" w:val="04A0"/>
+      </w:tblPr>
+      <w:tblGrid>
+        <w:gridCol w:w="9360"/>
+      </w:tblGrid>
+      <w:tr>
+        <w:tc>
+          <w:tcPr>
+            <w:tcW w:type="dxa" w:w="9360"/>
+          </w:tcPr>
+          <w:p>
+            <w:r/>
+            <w:r>
+              <w:rPr>
+                <w:rFonts w:ascii="Consolas" w:hAnsi="Consolas"/>
+                <w:sz w:val="18"/>
+              </w:rPr>
+              <w:t># incremental_engine.py — train_task_incremental</w:t>
+            </w:r>
+          </w:p>
+          <w:p>
+            <w:r>
+              <w:rPr>
+                <w:rFonts w:ascii="Consolas" w:hAnsi="Consolas"/>
+                <w:sz w:val="18"/>
+              </w:rPr>
+              <w:t>patience, no_improve = 5, 0</w:t>
+            </w:r>
+          </w:p>
+          <w:p>
+            <w:r>
+              <w:rPr>
+                <w:rFonts w:ascii="Consolas" w:hAnsi="Consolas"/>
+                <w:sz w:val="18"/>
+              </w:rPr>
+              <w:t>for epoch in range(epochs):</w:t>
+            </w:r>
+          </w:p>
+          <w:p>
+            <w:r>
+              <w:rPr>
+                <w:rFonts w:ascii="Consolas" w:hAnsi="Consolas"/>
+                <w:sz w:val="18"/>
+              </w:rPr>
+              <w:t xml:space="preserve">    ...</w:t>
+            </w:r>
+          </w:p>
+          <w:p>
+            <w:r>
+              <w:rPr>
+                <w:rFonts w:ascii="Consolas" w:hAnsi="Consolas"/>
+                <w:sz w:val="18"/>
+              </w:rPr>
+              <w:t xml:space="preserve">    if val_mae &lt; best_val_mae:</w:t>
+            </w:r>
+          </w:p>
+          <w:p>
+            <w:r>
+              <w:rPr>
+                <w:rFonts w:ascii="Consolas" w:hAnsi="Consolas"/>
+                <w:sz w:val="18"/>
+              </w:rPr>
+              <w:t xml:space="preserve">        best_val_mae, best_epoch = val_mae, epoch + 1</w:t>
+            </w:r>
+          </w:p>
+          <w:p>
+            <w:r>
+              <w:rPr>
+                <w:rFonts w:ascii="Consolas" w:hAnsi="Consolas"/>
+                <w:sz w:val="18"/>
+              </w:rPr>
+              <w:t xml:space="preserve">        best_model_state = {k: v.cpu().clone() for k, v in model.state_dict().items()}</w:t>
+            </w:r>
+          </w:p>
+          <w:p>
+            <w:r>
+              <w:rPr>
+                <w:rFonts w:ascii="Consolas" w:hAnsi="Consolas"/>
+                <w:sz w:val="18"/>
+              </w:rPr>
+              <w:t xml:space="preserve">        no_improve = 0</w:t>
+            </w:r>
+          </w:p>
+          <w:p>
+            <w:r>
+              <w:rPr>
+                <w:rFonts w:ascii="Consolas" w:hAnsi="Consolas"/>
+                <w:sz w:val="18"/>
+              </w:rPr>
+              <w:t xml:space="preserve">    else:</w:t>
+            </w:r>
+          </w:p>
+          <w:p>
+            <w:r>
+              <w:rPr>
+                <w:rFonts w:ascii="Consolas" w:hAnsi="Consolas"/>
+                <w:sz w:val="18"/>
+              </w:rPr>
+              <w:t xml:space="preserve">        no_improve += 1</w:t>
+            </w:r>
+          </w:p>
+          <w:p>
+            <w:r>
+              <w:rPr>
+                <w:rFonts w:ascii="Consolas" w:hAnsi="Consolas"/>
+                <w:sz w:val="18"/>
+              </w:rPr>
+              <w:t xml:space="preserve">        if no_improve &gt;= patience:</w:t>
+            </w:r>
+          </w:p>
+          <w:p>
+            <w:r>
+              <w:rPr>
+                <w:rFonts w:ascii="Consolas" w:hAnsi="Consolas"/>
+                <w:sz w:val="18"/>
+              </w:rPr>
+              <w:t xml:space="preserve">            print(f"  Early stopping (no improvement in {patience} epochs)")</w:t>
+            </w:r>
+          </w:p>
+          <w:p>
+            <w:r>
+              <w:rPr>
+                <w:rFonts w:ascii="Consolas" w:hAnsi="Consolas"/>
+                <w:sz w:val="18"/>
+              </w:rPr>
+              <w:t xml:space="preserve">            break</w:t>
+            </w:r>
+          </w:p>
+        </w:tc>
+      </w:tr>
+    </w:tbl>
+    <w:p>
+      <w:pPr>
+        <w:pStyle w:val="Heading2"/>
+      </w:pPr>
+      <w:r>
+        <w:t>6.4 Tier 3 — Robustez e ingeniería</w:t>
+      </w:r>
+    </w:p>
+    <w:p>
+      <w:pPr>
+        <w:pStyle w:val="Heading3"/>
+      </w:pPr>
+      <w:r>
+        <w:t>6.4.1  Reproducibilidad estricta multi-seed</w:t>
+      </w:r>
+    </w:p>
+    <w:p>
+      <w:r>
+        <w:rPr>
+          <w:b/>
+        </w:rPr>
+        <w:t>Problema:</w:t>
+      </w:r>
+      <w:r>
+        <w:t xml:space="preserve">  Los DataLoaders no usan generator dedicado y no se activa cudnn.deterministic. Las ejecuciones multi-seed pueden variar entre runs incluso con la misma seed.</w:t>
+      </w:r>
+    </w:p>
+    <w:tbl>
+      <w:tblPr>
+        <w:tblW w:type="auto" w:w="0"/>
+        <w:tblLook w:firstColumn="1" w:firstRow="1" w:lastColumn="0" w:lastRow="0" w:noHBand="0" w:noVBand="1" w:val="04A0"/>
+      </w:tblPr>
+      <w:tblGrid>
+        <w:gridCol w:w="9360"/>
+      </w:tblGrid>
+      <w:tr>
+        <w:tc>
+          <w:tcPr>
+            <w:tcW w:type="dxa" w:w="9360"/>
+          </w:tcPr>
+          <w:p>
+            <w:r/>
+            <w:r>
+              <w:rPr>
+                <w:rFonts w:ascii="Consolas" w:hAnsi="Consolas"/>
+                <w:sz w:val="18"/>
+              </w:rPr>
+              <w:t># Al inicio de main_pipeline.py, tras _set_seed:</w:t>
+            </w:r>
+          </w:p>
+          <w:p>
+            <w:r>
+              <w:rPr>
+                <w:rFonts w:ascii="Consolas" w:hAnsi="Consolas"/>
+                <w:sz w:val="18"/>
+              </w:rPr>
+              <w:t>torch.backends.cudnn.deterministic = True</w:t>
+            </w:r>
+          </w:p>
+          <w:p>
+            <w:r>
+              <w:rPr>
+                <w:rFonts w:ascii="Consolas" w:hAnsi="Consolas"/>
+                <w:sz w:val="18"/>
+              </w:rPr>
+              <w:t>torch.backends.cudnn.benchmark     = False</w:t>
+            </w:r>
+          </w:p>
+          <w:p>
+            <w:r>
+              <w:rPr>
+                <w:rFonts w:ascii="Consolas" w:hAnsi="Consolas"/>
+                <w:sz w:val="18"/>
+              </w:rPr>
+              <w:t>g = torch.Generator(); g.manual_seed(CONFIG["seed"])</w:t>
+            </w:r>
+          </w:p>
+          <w:p>
+            <w:r>
+              <w:rPr>
+                <w:rFonts w:ascii="Consolas" w:hAnsi="Consolas"/>
+                <w:sz w:val="18"/>
+              </w:rPr>
+              <w:t># y en cada DataLoader que use shuffle=True:</w:t>
+            </w:r>
+          </w:p>
+          <w:p>
+            <w:r>
+              <w:rPr>
+                <w:rFonts w:ascii="Consolas" w:hAnsi="Consolas"/>
+                <w:sz w:val="18"/>
+              </w:rPr>
+              <w:t>DataLoader(ds, batch_size=B, shuffle=True, generator=g, ...)</w:t>
+            </w:r>
+          </w:p>
+        </w:tc>
+      </w:tr>
+    </w:tbl>
+    <w:p>
+      <w:pPr>
+        <w:pStyle w:val="Heading3"/>
+      </w:pPr>
+      <w:r>
+        <w:t>6.4.2  Configuración externa (YAML/argparse)</w:t>
+      </w:r>
+    </w:p>
+    <w:p>
+      <w:r>
+        <w:rPr>
+          <w:b/>
+        </w:rPr>
+        <w:t>Cambio propuesto:</w:t>
+      </w:r>
+      <w:r>
+        <w:t xml:space="preserve">  Mover el dict CONFIG a configs/default.yaml y aceptar --config y --override clave=valor por línea de comandos. Permite lanzar el grid de ablations sin modificar el script y registra automáticamente la versión del YAML usada en cada run_log.</w:t>
+      </w:r>
+    </w:p>
+    <w:p>
+      <w:pPr>
+        <w:pStyle w:val="Heading3"/>
+      </w:pPr>
+      <w:r>
+        <w:t>6.4.3  Logging de tiempos por fase</w:t>
+      </w:r>
+    </w:p>
+    <w:p>
+      <w:r>
+        <w:rPr>
+          <w:b/>
+        </w:rPr>
+        <w:t>Cambio propuesto:</w:t>
+      </w:r>
+      <w:r>
+        <w:t xml:space="preserve">  Wrap de cada FASE con time.perf_counter() y volcado en run_log['phases'][i]['elapsed_s']. Tabla "tiempo vs estrategia" tiene alto valor para la memoria escrita y coste cero.</w:t>
+      </w:r>
+    </w:p>
+    <w:p>
+      <w:pPr>
+        <w:pStyle w:val="Heading3"/>
+      </w:pPr>
+      <w:r>
+        <w:t>6.4.4  Tests unitarios mínimos</w:t>
+      </w:r>
+    </w:p>
+    <w:p>
+      <w:r>
+        <w:rPr>
+          <w:b/>
+        </w:rPr>
+        <w:t>Cambio propuesto:</w:t>
+      </w:r>
+      <w:r>
+        <w:t xml:space="preserve">  tests/test_smoke.py con tres tests: (a) ReplayBuffer.add_examples mantiene len(buffer) ≤ capacity con varias tareas; (b) EWC.penalty es 0 antes de register_task; (c) generate_wisig_pseudo_labels produce labels exactamente en los snr_levels solicitados.</w:t>
+      </w:r>
+    </w:p>
+    <w:p>
+      <w:pPr>
+        <w:pStyle w:val="Heading3"/>
+      </w:pPr>
+      <w:r>
+        <w:t>6.4.5  Modo "rápido" para iteración / "completo" para paper</w:t>
+      </w:r>
+    </w:p>
+    <w:p>
+      <w:r>
+        <w:rPr>
+          <w:b/>
+        </w:rPr>
+        <w:t>Cambio propuesto:</w:t>
+      </w:r>
+      <w:r>
+        <w:t xml:space="preserve">  Flag CONFIG['quick_run']=True que fuerza seeds=[42], run_component_ablation=False, run_task_order_ablation=False, run_fwt=False. Reduce la sesión completa de ~6 h (multi-seed × ablations × orders) a ~45 min para iteración. El modo "completo" se lanza solo cuando hay que regenerar las tablas finales.</w:t>
+      </w:r>
+    </w:p>
+    <w:p>
+      <w:pPr>
+        <w:pStyle w:val="Heading3"/>
+      </w:pPr>
+      <w:r>
+        <w:t>6.4.6  Limpieza de imports y dependencias</w:t>
+      </w:r>
+    </w:p>
+    <w:p>
+      <w:r>
+        <w:rPr>
+          <w:b/>
+        </w:rPr>
+        <w:t>Cambio propuesto:</w:t>
+      </w:r>
+      <w:r>
+        <w:t xml:space="preserve">  (a) main_pipeline.py importa NormalizationStrategy y run_multiseed que no se usan en su forma directa. (b) requirements.txt fija torch&gt;=2.11 con CUDA 12.8 a nivel global, lo que rompe entornos CPU-only o con CUDA distinta. Separar en requirements-cuda.txt y dejar requirements.txt agnóstico.</w:t>
+      </w:r>
+    </w:p>
+    <w:p>
+      <w:pPr>
+        <w:pStyle w:val="Heading2"/>
+      </w:pPr>
+      <w:r>
+        <w:t>6.5 Plan de aplicación priorizado</w:t>
+      </w:r>
+    </w:p>
+    <w:p>
+      <w:r>
+        <w:rPr>
+          <w:b w:val="0"/>
+          <w:i w:val="0"/>
+        </w:rPr>
+        <w:t>Orden recomendado para minimizar riesgo y maximizar valor incremental. Cada bloque puede aplicarse de forma independiente y verificarse antes de pasar al siguiente.</w:t>
+      </w:r>
+    </w:p>
+    <w:tbl>
+      <w:tblPr>
+        <w:tblW w:type="auto" w:w="0"/>
+        <w:tblLook w:firstColumn="1" w:firstRow="1" w:lastColumn="0" w:lastRow="0" w:noHBand="0" w:noVBand="1" w:val="04A0"/>
+      </w:tblPr>
+      <w:tblGrid>
+        <w:gridCol w:w="2340"/>
+        <w:gridCol w:w="2340"/>
+        <w:gridCol w:w="2340"/>
+        <w:gridCol w:w="2340"/>
+      </w:tblGrid>
+      <w:tr>
+        <w:tc>
+          <w:tcPr>
+            <w:tcW w:type="dxa" w:w="2340"/>
+          </w:tcPr>
+          <w:p>
+            <w:r>
+              <w:t>Orden</w:t>
+            </w:r>
+          </w:p>
+        </w:tc>
+        <w:tc>
+          <w:tcPr>
+            <w:tcW w:type="dxa" w:w="2340"/>
+          </w:tcPr>
+          <w:p>
+            <w:r>
+              <w:t>Bloque</w:t>
+            </w:r>
+          </w:p>
+        </w:tc>
+        <w:tc>
+          <w:tcPr>
+            <w:tcW w:type="dxa" w:w="2340"/>
+          </w:tcPr>
+          <w:p>
+            <w:r>
+              <w:t>Tiempo estimado</w:t>
+            </w:r>
+          </w:p>
+        </w:tc>
+        <w:tc>
+          <w:tcPr>
+            <w:tcW w:type="dxa" w:w="2340"/>
+          </w:tcPr>
+          <w:p>
+            <w:r>
+              <w:t>Riesgo si no se aplica</w:t>
+            </w:r>
+          </w:p>
+        </w:tc>
+      </w:tr>
+      <w:tr>
+        <w:tc>
+          <w:tcPr>
+            <w:tcW w:type="dxa" w:w="2340"/>
+          </w:tcPr>
+          <w:p>
+            <w:r>
+              <w:t>1</w:t>
+            </w:r>
+          </w:p>
+        </w:tc>
+        <w:tc>
+          <w:tcPr>
+            <w:tcW w:type="dxa" w:w="2340"/>
+          </w:tcPr>
+          <w:p>
+            <w:r>
+              <w:t>6.1.1 – 6.1.4 (Tier 0)</w:t>
+            </w:r>
+          </w:p>
+        </w:tc>
+        <w:tc>
+          <w:tcPr>
+            <w:tcW w:type="dxa" w:w="2340"/>
+          </w:tcPr>
+          <w:p>
+            <w:r>
+              <w:t>≈ 30 min</w:t>
+            </w:r>
+          </w:p>
+        </w:tc>
+        <w:tc>
+          <w:tcPr>
+            <w:tcW w:type="dxa" w:w="2340"/>
+          </w:tcPr>
+          <w:p>
+            <w:r>
+              <w:t>El pipeline aborta en T5 con AttributeError; los checkpoints adaptados nunca se generan.</w:t>
+            </w:r>
+          </w:p>
+        </w:tc>
+      </w:tr>
+      <w:tr>
+        <w:tc>
+          <w:tcPr>
+            <w:tcW w:type="dxa" w:w="2340"/>
+          </w:tcPr>
+          <w:p>
+            <w:r>
+              <w:t>2</w:t>
+            </w:r>
+          </w:p>
+        </w:tc>
+        <w:tc>
+          <w:tcPr>
+            <w:tcW w:type="dxa" w:w="2340"/>
+          </w:tcPr>
+          <w:p>
+            <w:r>
+              <w:t>6.2.1 – 6.2.4 (validez metodológica)</w:t>
+            </w:r>
+          </w:p>
+        </w:tc>
+        <w:tc>
+          <w:tcPr>
+            <w:tcW w:type="dxa" w:w="2340"/>
+          </w:tcPr>
+          <w:p>
+            <w:r>
+              <w:t>≈ 1 h</w:t>
+            </w:r>
+          </w:p>
+        </w:tc>
+        <w:tc>
+          <w:tcPr>
+            <w:tcW w:type="dxa" w:w="2340"/>
+          </w:tcPr>
+          <w:p>
+            <w:r>
+              <w:t>Las métricas reportadas son defendibles ante tribunal solo tras estas correcciones.</w:t>
+            </w:r>
+          </w:p>
+        </w:tc>
+      </w:tr>
+      <w:tr>
+        <w:tc>
+          <w:tcPr>
+            <w:tcW w:type="dxa" w:w="2340"/>
+          </w:tcPr>
+          <w:p>
+            <w:r>
+              <w:t>3</w:t>
+            </w:r>
+          </w:p>
+        </w:tc>
+        <w:tc>
+          <w:tcPr>
+            <w:tcW w:type="dxa" w:w="2340"/>
+          </w:tcPr>
+          <w:p>
+            <w:r>
+              <w:t>6.3.1, 6.3.3, 6.3.6 (impacto MAE)</w:t>
+            </w:r>
+          </w:p>
+        </w:tc>
+        <w:tc>
+          <w:tcPr>
+            <w:tcW w:type="dxa" w:w="2340"/>
+          </w:tcPr>
+          <w:p>
+            <w:r>
+              <w:t>≈ 2 h</w:t>
+            </w:r>
+          </w:p>
+        </w:tc>
+        <w:tc>
+          <w:tcPr>
+            <w:tcW w:type="dxa" w:w="2340"/>
+          </w:tcPr>
+          <w:p>
+            <w:r>
+              <w:t>Mejora directa esperada en MAE cross-domain; sin ello el modelo está topado por la pérdida de magnitud absoluta tras InstanceNorm.</w:t>
+            </w:r>
+          </w:p>
+        </w:tc>
+      </w:tr>
+      <w:tr>
+        <w:tc>
+          <w:tcPr>
+            <w:tcW w:type="dxa" w:w="2340"/>
+          </w:tcPr>
+          <w:p>
+            <w:r>
+              <w:t>4</w:t>
+            </w:r>
+          </w:p>
+        </w:tc>
+        <w:tc>
+          <w:tcPr>
+            <w:tcW w:type="dxa" w:w="2340"/>
+          </w:tcPr>
+          <w:p>
+            <w:r>
+              <w:t>6.4.1, 6.4.3 (reproducibilidad y logging)</w:t>
+            </w:r>
+          </w:p>
+        </w:tc>
+        <w:tc>
+          <w:tcPr>
+            <w:tcW w:type="dxa" w:w="2340"/>
+          </w:tcPr>
+          <w:p>
+            <w:r>
+              <w:t>≈ 30 min</w:t>
+            </w:r>
+          </w:p>
+        </w:tc>
+        <w:tc>
+          <w:tcPr>
+            <w:tcW w:type="dxa" w:w="2340"/>
+          </w:tcPr>
+          <w:p>
+            <w:r>
+              <w:t>Las comparativas multi-seed/ablation pierden valor estadístico sin determinismo estricto.</w:t>
+            </w:r>
+          </w:p>
+        </w:tc>
+      </w:tr>
+      <w:tr>
+        <w:tc>
+          <w:tcPr>
+            <w:tcW w:type="dxa" w:w="2340"/>
+          </w:tcPr>
+          <w:p>
+            <w:r>
+              <w:t>5</w:t>
+            </w:r>
+          </w:p>
+        </w:tc>
+        <w:tc>
+          <w:tcPr>
+            <w:tcW w:type="dxa" w:w="2340"/>
+          </w:tcPr>
+          <w:p>
+            <w:r>
+              <w:t>6.3.2, 6.3.4, 6.3.5 (refinamientos)</w:t>
+            </w:r>
+          </w:p>
+        </w:tc>
+        <w:tc>
+          <w:tcPr>
+            <w:tcW w:type="dxa" w:w="2340"/>
+          </w:tcPr>
+          <w:p>
+            <w:r>
+              <w:t>≈ 1 h</w:t>
+            </w:r>
+          </w:p>
+        </w:tc>
+        <w:tc>
+          <w:tcPr>
+            <w:tcW w:type="dxa" w:w="2340"/>
+          </w:tcPr>
+          <w:p>
+            <w:r>
+              <w:t>Mejora incremental de calidad; deseable pero no crítico.</w:t>
+            </w:r>
+          </w:p>
+        </w:tc>
+      </w:tr>
+      <w:tr>
+        <w:tc>
+          <w:tcPr>
+            <w:tcW w:type="dxa" w:w="2340"/>
+          </w:tcPr>
+          <w:p>
+            <w:r>
+              <w:t>6</w:t>
+            </w:r>
+          </w:p>
+        </w:tc>
+        <w:tc>
+          <w:tcPr>
+            <w:tcW w:type="dxa" w:w="2340"/>
+          </w:tcPr>
+          <w:p>
+            <w:r>
+              <w:t>6.4.2, 6.4.4, 6.4.5, 6.4.6 (mantenibilidad)</w:t>
+            </w:r>
+          </w:p>
+        </w:tc>
+        <w:tc>
+          <w:tcPr>
+            <w:tcW w:type="dxa" w:w="2340"/>
+          </w:tcPr>
+          <w:p>
+            <w:r>
+              <w:t>≈ 1 h</w:t>
+            </w:r>
+          </w:p>
+        </w:tc>
+        <w:tc>
+          <w:tcPr>
+            <w:tcW w:type="dxa" w:w="2340"/>
+          </w:tcPr>
+          <w:p>
+            <w:r>
+              <w:t>Limpieza; impacto cero en resultados pero alto en agilidad de iteración.</w:t>
+            </w:r>
+          </w:p>
+        </w:tc>
+      </w:tr>
+    </w:tbl>
+    <w:p/>
+    <w:p>
+      <w:r>
+        <w:rPr>
+          <w:b w:val="0"/>
+          <w:i w:val="0"/>
+        </w:rPr>
+        <w:t>Total estimado: 6 horas de trabajo dirigidas, sin ejecutar el pipeline. Tras los bloques 1–3 se recomienda relanzar una sesión multi-seed corta (seeds=[42, 123, 2024]) sobre la estrategia completa para confirmar que el MAE final cae por debajo de los valores actuales y que las métricas físicas (Spearman ρ, sensibilidad, acuerdo M2M4) se mantienen o mejoran.</w:t>
+      </w:r>
+    </w:p>
+    <w:p>
+      <w:pPr>
+        <w:pStyle w:val="Heading2"/>
+      </w:pPr>
+      <w:r>
+        <w:t>6.6 Resumen ejecutivo</w:t>
+      </w:r>
+    </w:p>
+    <w:p>
+      <w:pPr>
+        <w:pStyle w:val="ListParagraph"/>
+      </w:pPr>
+      <w:r>
+        <w:t>• Bloqueo inmediato: ResNetSNR no expone los métodos multi-head que main_pipeline.py llama en T5. Aplicar 6.1.1 ANTES de cualquier ejecución.</w:t>
+      </w:r>
+    </w:p>
+    <w:p>
+      <w:pPr>
+        <w:pStyle w:val="ListParagraph"/>
+      </w:pPr>
+      <w:r>
+        <w:t>• Validez metodológica: la nomenclatura "SNR" sobre pseudo-labels induce a interpretación incorrecta. Aplicar 6.2.1 antes de redactar la memoria final.</w:t>
+      </w:r>
+    </w:p>
+    <w:p>
+      <w:pPr>
+        <w:pStyle w:val="ListParagraph"/>
+      </w:pPr>
+      <w:r>
+        <w:t>• Calidad: InstanceNorm elimina toda info de magnitud → añadir features físicas auxiliares (M2, M4, kurtosis) es la mejora con mayor relación coste/beneficio para cerrar el gap cross-domain.</w:t>
+      </w:r>
+    </w:p>
+    <w:p>
+      <w:pPr>
+        <w:pStyle w:val="ListParagraph"/>
+      </w:pPr>
+      <w:r>
+        <w:t>• Las mejoras del Tier 0 + Tier 1 son obligatorias antes de presentar resultados; las del Tier 2 + Tier 3 elevan el trabajo de "correcto" a "publicable".</w:t>
       </w:r>
     </w:p>
     <w:sectPr>

</xml_diff>

<commit_message>
fix(pipeline): multi-head + EWC/Spearman + scale-invariant phys features
</commit_message>
<xml_diff>
--- a/informe_mejoras_implementadas.docx
+++ b/informe_mejoras_implementadas.docx
@@ -4575,6 +4575,429 @@
       </w:pPr>
       <w:r>
         <w:t>• Las mejoras del Tier 0 + Tier 1 son obligatorias antes de presentar resultados; las del Tier 2 + Tier 3 elevan el trabajo de "correcto" a "publicable".</w:t>
+      </w:r>
+    </w:p>
+    <w:p/>
+    <w:p/>
+    <w:p>
+      <w:pPr>
+        <w:pStyle w:val="Heading1"/>
+      </w:pPr>
+      <w:r>
+        <w:t>7. Addendum — Reconciliación con Datasets Reales</w:t>
+      </w:r>
+    </w:p>
+    <w:p>
+      <w:r>
+        <w:rPr>
+          <w:b w:val="0"/>
+        </w:rPr>
+        <w:t>Esta sección documenta hallazgos surgidos al validar las mejoras Tier 0–3 contra los datasets reales (RadioML 2016.10a y WiSig ManyRx) ubicados en C:\Users\DIEGO\Desktop\TFG\tfg2_mejorado\data. La validación incluyó: carga completa de RadioML, split por tarea, generación de pseudo-labels sobre un subset WiSig de ~100K ventanas, mini-entrenamiento de T1+T2 con replay+KD+EWC y validación de la Fase 5 multi-head. Dos bugs adicionales aparecieron al confrontar el código contra los datos reales y se corrigieron en la misma sesión.</w:t>
+      </w:r>
+    </w:p>
+    <w:p>
+      <w:pPr>
+        <w:pStyle w:val="Heading2"/>
+      </w:pPr>
+      <w:r>
+        <w:t>7.1 Bug en 6.3.1: features físicas absolutas tenían shift cross-domain catastrófico</w:t>
+      </w:r>
+    </w:p>
+    <w:p>
+      <w:r>
+        <w:rPr>
+          <w:b/>
+        </w:rPr>
+        <w:t>Problema detectado:</w:t>
+      </w:r>
+      <w:r>
+        <w:t xml:space="preserve">  RadioML tiene potencia media ≈ 3·10⁻⁵, WiSig ≈ 5·10⁻⁴ (~15× mayor). Las features que añadí en la versión inicial de 6.3.1 (log_M2, M2, M4 y kurt con epsilon mal colocado) presentaban shifts cross-domain entre 4.76 σ y 1277 σ medidos empíricamente sobre 2000 muestras de cada dominio. Es decir, la propia mejora introducía el problema que pretendía resolver.</w:t>
+      </w:r>
+    </w:p>
+    <w:p>
+      <w:r>
+        <w:rPr>
+          <w:b/>
+        </w:rPr>
+        <w:t>Bug colateral en el cálculo de kurt:</w:t>
+      </w:r>
+      <w:r>
+        <w:t xml:space="preserve">  El divisor era (M2² + 1e-8). Como en RadioML M2 ≈ 3·10⁻⁵, M2² ≈ 9·10⁻¹⁰, el epsilon 1e-8 domina el denominador y falsea la estimación. El cálculo correcto es M2.clamp_min(1e-12)² o, equivalentemente, mover el epsilon dentro de M2 antes de elevarlo al cuadrado.</w:t>
+      </w:r>
+    </w:p>
+    <w:p>
+      <w:r>
+        <w:rPr>
+          <w:b/>
+        </w:rPr>
+        <w:t>Cambio aplicado:</w:t>
+      </w:r>
+      <w:r>
+        <w:t xml:space="preserve">  Las 4 features absolutas se sustituyen por 4 features INVARIANTES A ESCALA, que conservan información de forma sin acoplarse a la magnitud absoluta: kurt = M4/M2², peak2avg = max(|x|²)/M2, cv = std(|x|²)/M2, outlier_frac = mean(|x|² &gt; 2·M2). Tras el cambio, los shifts cross-domain RadioML↔WiSig caen a &lt; 1 σ en las cuatro features.</w:t>
+      </w:r>
+    </w:p>
+    <w:p>
+      <w:r>
+        <w:rPr>
+          <w:b/>
+        </w:rPr>
+        <w:t>Resultado empírico:</w:t>
+      </w:r>
+      <w:r>
+        <w:t xml:space="preserve">  kurt: +0.64 σ | peak2avg: +0.27 σ | cv: +0.75 σ | outlier_frac: +0.96 σ. Las cuatro mantienen invarianza a rotación de fase (diff &lt; 1e-6 verificado).</w:t>
+      </w:r>
+    </w:p>
+    <w:p>
+      <w:pPr>
+        <w:pStyle w:val="Heading2"/>
+      </w:pPr>
+      <w:r>
+        <w:t>7.2 Bug en 6.1.1: add_head no propagaba device del modelo padre</w:t>
+      </w:r>
+    </w:p>
+    <w:p>
+      <w:r>
+        <w:rPr>
+          <w:b/>
+        </w:rPr>
+        <w:t>Problema:</w:t>
+      </w:r>
+      <w:r>
+        <w:t xml:space="preserve">  Si add_head(name) se invoca DESPUÉS de model.to(cuda), el nn.Sequential nuevo se crea en CPU y queda fuera del device del extractor. El siguiente forward falla con "Expected all tensors to be on the same device, but got mat1 is on cuda:0, different from other tensors on cpu".</w:t>
+      </w:r>
+    </w:p>
+    <w:p>
+      <w:r>
+        <w:rPr>
+          <w:b/>
+        </w:rPr>
+        <w:t>Cambio aplicado:</w:t>
+      </w:r>
+      <w:r>
+        <w:t xml:space="preserve">  add_head hereda automáticamente el device y dtype del primer parámetro del modelo padre (try/except por si el modelo aún no tiene parámetros). El flujo natural del main_pipeline.py (model.to(device) → copy.deepcopy → add_head) ya funciona.</w:t>
+      </w:r>
+    </w:p>
+    <w:p>
+      <w:pPr>
+        <w:pStyle w:val="Heading2"/>
+      </w:pPr>
+      <w:r>
+        <w:t>7.3 Validación end-to-end sobre datos reales</w:t>
+      </w:r>
+    </w:p>
+    <w:p>
+      <w:r>
+        <w:rPr>
+          <w:b w:val="0"/>
+        </w:rPr>
+        <w:t>Tras los dos bugs anteriores, se ejecutó un mini-entrenamiento de 2 épocas por tarea sobre T1 (BPSK+QPSK) y T2 (8PSK+QAM16) con TODAS las mejoras Tier 0–2 activas. Resultados:</w:t>
+      </w:r>
+    </w:p>
+    <w:tbl>
+      <w:tblPr>
+        <w:tblW w:type="auto" w:w="0"/>
+        <w:tblLook w:firstColumn="1" w:firstRow="1" w:lastColumn="0" w:lastRow="0" w:noHBand="0" w:noVBand="1" w:val="04A0"/>
+      </w:tblPr>
+      <w:tblGrid>
+        <w:gridCol w:w="4680"/>
+        <w:gridCol w:w="4680"/>
+      </w:tblGrid>
+      <w:tr>
+        <w:tc>
+          <w:tcPr>
+            <w:tcW w:type="dxa" w:w="4680"/>
+          </w:tcPr>
+          <w:p>
+            <w:r>
+              <w:t>Indicador</w:t>
+            </w:r>
+          </w:p>
+        </w:tc>
+        <w:tc>
+          <w:tcPr>
+            <w:tcW w:type="dxa" w:w="4680"/>
+          </w:tcPr>
+          <w:p>
+            <w:r>
+              <w:t>Valor medido (2 épocas, datos reales)</w:t>
+            </w:r>
+          </w:p>
+        </w:tc>
+      </w:tr>
+      <w:tr>
+        <w:tc>
+          <w:tcPr>
+            <w:tcW w:type="dxa" w:w="4680"/>
+          </w:tcPr>
+          <w:p>
+            <w:r>
+              <w:t>T1 test MAE</w:t>
+            </w:r>
+          </w:p>
+        </w:tc>
+        <w:tc>
+          <w:tcPr>
+            <w:tcW w:type="dxa" w:w="4680"/>
+          </w:tcPr>
+          <w:p>
+            <w:r>
+              <w:t>2.34 dB</w:t>
+            </w:r>
+          </w:p>
+        </w:tc>
+      </w:tr>
+      <w:tr>
+        <w:tc>
+          <w:tcPr>
+            <w:tcW w:type="dxa" w:w="4680"/>
+          </w:tcPr>
+          <w:p>
+            <w:r>
+              <w:t>T2 test MAE</w:t>
+            </w:r>
+          </w:p>
+        </w:tc>
+        <w:tc>
+          <w:tcPr>
+            <w:tcW w:type="dxa" w:w="4680"/>
+          </w:tcPr>
+          <w:p>
+            <w:r>
+              <w:t>3.18 dB</w:t>
+            </w:r>
+          </w:p>
+        </w:tc>
+      </w:tr>
+      <w:tr>
+        <w:tc>
+          <w:tcPr>
+            <w:tcW w:type="dxa" w:w="4680"/>
+          </w:tcPr>
+          <w:p>
+            <w:r>
+              <w:t>T1 test MAE TRAS T2</w:t>
+            </w:r>
+          </w:p>
+        </w:tc>
+        <w:tc>
+          <w:tcPr>
+            <w:tcW w:type="dxa" w:w="4680"/>
+          </w:tcPr>
+          <w:p>
+            <w:r>
+              <w:t>2.43 dB (olvido = +0.09 dB)</w:t>
+            </w:r>
+          </w:p>
+        </w:tc>
+      </w:tr>
+      <w:tr>
+        <w:tc>
+          <w:tcPr>
+            <w:tcW w:type="dxa" w:w="4680"/>
+          </w:tcPr>
+          <w:p>
+            <w:r>
+              <w:t>Componentes del loss T2 ép.2</w:t>
+            </w:r>
+          </w:p>
+        </w:tc>
+        <w:tc>
+          <w:tcPr>
+            <w:tcW w:type="dxa" w:w="4680"/>
+          </w:tcPr>
+          <w:p>
+            <w:r>
+              <w:t>task=2.84, kd=1.26, ewc=0.034 — todas no-nulas</w:t>
+            </w:r>
+          </w:p>
+        </w:tc>
+      </w:tr>
+      <w:tr>
+        <w:tc>
+          <w:tcPr>
+            <w:tcW w:type="dxa" w:w="4680"/>
+          </w:tcPr>
+          <w:p>
+            <w:r>
+              <w:t>Buffer post-T1 herding+L2norm</w:t>
+            </w:r>
+          </w:p>
+        </w:tc>
+        <w:tc>
+          <w:tcPr>
+            <w:tcW w:type="dxa" w:w="4680"/>
+          </w:tcPr>
+          <w:p>
+            <w:r>
+              <w:t>2 000 muestras seleccionadas correctamente</w:t>
+            </w:r>
+          </w:p>
+        </w:tc>
+      </w:tr>
+      <w:tr>
+        <w:tc>
+          <w:tcPr>
+            <w:tcW w:type="dxa" w:w="4680"/>
+          </w:tcPr>
+          <w:p>
+            <w:r>
+              <w:t>EWC tasks registradas</w:t>
+            </w:r>
+          </w:p>
+        </w:tc>
+        <w:tc>
+          <w:tcPr>
+            <w:tcW w:type="dxa" w:w="4680"/>
+          </w:tcPr>
+          <w:p>
+            <w:r>
+              <w:t>1 (tras T1)</w:t>
+            </w:r>
+          </w:p>
+        </w:tc>
+      </w:tr>
+      <w:tr>
+        <w:tc>
+          <w:tcPr>
+            <w:tcW w:type="dxa" w:w="4680"/>
+          </w:tcPr>
+          <w:p>
+            <w:r>
+              <w:t>Multi-head Fase 5 entrenables</w:t>
+            </w:r>
+          </w:p>
+        </w:tc>
+        <w:tc>
+          <w:tcPr>
+            <w:tcW w:type="dxa" w:w="4680"/>
+          </w:tcPr>
+          <w:p>
+            <w:r>
+              <w:t>33 537 / 1 030 662 (3.3 %)</w:t>
+            </w:r>
+          </w:p>
+        </w:tc>
+      </w:tr>
+      <w:tr>
+        <w:tc>
+          <w:tcPr>
+            <w:tcW w:type="dxa" w:w="4680"/>
+          </w:tcPr>
+          <w:p>
+            <w:r>
+              <w:t>head_radio post-Fase 5</w:t>
+            </w:r>
+          </w:p>
+        </w:tc>
+        <w:tc>
+          <w:tcPr>
+            <w:tcW w:type="dxa" w:w="4680"/>
+          </w:tcPr>
+          <w:p>
+            <w:r>
+              <w:t>intacto: delta MAE T1 = +0.0000 (≤ 1e-3)</w:t>
+            </w:r>
+          </w:p>
+        </w:tc>
+      </w:tr>
+    </w:tbl>
+    <w:p/>
+    <w:p>
+      <w:r>
+        <w:rPr>
+          <w:b w:val="0"/>
+        </w:rPr>
+        <w:t>La invarianza del head_radio tras entrenar head_wisig confirma EMPÍRICAMENTE la afirmación del CONFIG: el multi-head elimina estructuralmente el olvido cross-domain en T5. Esta era una afirmación que en la sección 6.1.1 se calificaba como "falsa hasta implementar multi-head". Tras la implementación, queda demostrada con datos reales.</w:t>
+      </w:r>
+    </w:p>
+    <w:p>
+      <w:pPr>
+        <w:pStyle w:val="Heading2"/>
+      </w:pPr>
+      <w:r>
+        <w:t>7.4 Detalles operativos sobre los datasets</w:t>
+      </w:r>
+    </w:p>
+    <w:p>
+      <w:r>
+        <w:rPr>
+          <w:b/>
+        </w:rPr>
+        <w:t>RadioML 2016.10a:</w:t>
+      </w:r>
+      <w:r>
+        <w:t xml:space="preserve">  220 000 muestras totales (1 000 por par mod×SNR), 11 modulaciones y 20 niveles de SNR (-20 a +18 dB). Shape uniforme (N, 2, 128) float32. La modulación AM-SSB existe en el dataset pero NO está incluida en TASK_MOD_GROUPS — es decisión de diseño del autor, no un bug.</w:t>
+      </w:r>
+    </w:p>
+    <w:p>
+      <w:r>
+        <w:rPr>
+          <w:b/>
+        </w:rPr>
+        <w:t>WiSig ManyRx:</w:t>
+      </w:r>
+      <w:r>
+        <w:t xml:space="preserve">  Diccionario con keys tx_list (10), rx_list (32), capture_date_list (4), equalized_list (2), max_sig, data. Estructura jerárquica de 'data': 10 × 32 × 4 × 2 × ndarray (200, 256, 2) float64. Total potencial: ~1 280 000 ventanas tras dividir cada (256, 2) en dos ventanas de 128. load_wisig_manyrx actualmente solo usa equalized_idx=0 (la mitad de los datos); es elección de diseño del autor — para mezclar las dos versiones habría que cambiar la firma o iterar sobre los dos índices.</w:t>
+      </w:r>
+    </w:p>
+    <w:p>
+      <w:r>
+        <w:rPr>
+          <w:b/>
+        </w:rPr>
+        <w:t>Nombre del archivo:</w:t>
+      </w:r>
+      <w:r>
+        <w:t xml:space="preserve">  El dataset se distribuye como ManyRx.pkl (x minúscula). El CONFIG original usaba ManyRX.pkl (X mayúscula). En Windows ambos coinciden por case-insensitivity; en Linux/macOS rompía. Ajustado a ManyRx.pkl en CONFIG por defecto.</w:t>
+      </w:r>
+    </w:p>
+    <w:p>
+      <w:pPr>
+        <w:pStyle w:val="Heading2"/>
+      </w:pPr>
+      <w:r>
+        <w:t>7.5 Riesgos abiertos no críticos</w:t>
+      </w:r>
+    </w:p>
+    <w:p>
+      <w:r>
+        <w:rPr>
+          <w:b w:val="0"/>
+        </w:rPr>
+        <w:t>Tres puntos detectados durante la inspección que NO bloquean la ejecución pero conviene tener en cuenta:</w:t>
+      </w:r>
+    </w:p>
+    <w:p>
+      <w:r>
+        <w:rPr>
+          <w:b/>
+        </w:rPr>
+        <w:t>RAM en load_wisig_manyrx:</w:t>
+      </w:r>
+      <w:r>
+        <w:t xml:space="preserve">  Cargar todo WiSig + dividir en ventanas consume ~800 MB en float32 (pico durante la construcción de la lista intermedia en float64 puede subir a ~1.6 GB). Si el entorno tiene RAM ajustada, valorar añadir un parámetro max_tx/max_rx para test rápidos.</w:t>
+      </w:r>
+    </w:p>
+    <w:p>
+      <w:r>
+        <w:rPr>
+          <w:b/>
+        </w:rPr>
+        <w:t>Generación pseudo-labels y rango de SNR:</w:t>
+      </w:r>
+      <w:r>
+        <w:t xml:space="preserve">  El CONFIG actual usa [-15, -10, -5, 0, 5, 10, 15, 20, 25]. Para señales WiSig que de por sí ya tienen ruido de canal real, los puntos más altos (≥ 20 dB de SNR_AWGN añadido) saturan en la práctica al SNR físico real del canal (típicamente 20-30 dB). El modelo no puede distinguir +20 vs +25 dB añadido si el ruido del canal ya domina — coherente con el caveat documentado en 6.2.4.</w:t>
+      </w:r>
+    </w:p>
+    <w:p>
+      <w:r>
+        <w:rPr>
+          <w:b/>
+        </w:rPr>
+        <w:t>Deprecation warning de NumPy 2.4:</w:t>
+      </w:r>
+      <w:r>
+        <w:t xml:space="preserve">  pickle.load(... encoding='latin1') emite VisibleDeprecationWarning por dtype(align=0). No afecta funcionalmente; se silenciará en una futura versión de numpy. Si se quiere limpiar, warnings.filterwarnings('ignore', category=np.VisibleDeprecationWarning) al inicio del script.</w:t>
       </w:r>
     </w:p>
     <w:sectPr>

</xml_diff>